<commit_message>
Single Search in Working
</commit_message>
<xml_diff>
--- a/document/TT_Search.docx
+++ b/document/TT_Search.docx
@@ -15,13 +15,21 @@
     </w:p>
     <w:p/>
     <w:p>
-      <w:r>
-        <w:t>date : August 11, 2026</w:t>
-      </w:r>
-    </w:p>
-    <w:p/>
-    <w:p>
-      <w:r>
+      <w:proofErr w:type="gramStart"/>
+      <w:r>
+        <w:t>date :</w:t>
+      </w:r>
+      <w:proofErr w:type="gramEnd"/>
+      <w:r>
+        <w:t xml:space="preserve"> August 11, 2026</w:t>
+      </w:r>
+    </w:p>
+    <w:p/>
+    <w:p>
+      <w:r>
+        <w:rPr>
+          <w:noProof/>
+        </w:rPr>
         <w:drawing>
           <wp:inline distT="0" distB="0" distL="0" distR="0" wp14:anchorId="481CF77A" wp14:editId="3DEE175F">
             <wp:extent cx="5943600" cy="1487170"/>
@@ -62,6 +70,9 @@
     <w:p/>
     <w:p>
       <w:r>
+        <w:rPr>
+          <w:noProof/>
+        </w:rPr>
         <w:drawing>
           <wp:inline distT="0" distB="0" distL="0" distR="0" wp14:anchorId="7C6C493F" wp14:editId="63C00253">
             <wp:extent cx="5943600" cy="1754505"/>
@@ -102,6 +113,9 @@
     <w:p/>
     <w:p>
       <w:r>
+        <w:rPr>
+          <w:noProof/>
+        </w:rPr>
         <w:lastRenderedPageBreak/>
         <w:drawing>
           <wp:inline distT="0" distB="0" distL="0" distR="0" wp14:anchorId="54DE5A9B" wp14:editId="5A03C84E">
@@ -143,6 +157,9 @@
     <w:p/>
     <w:p>
       <w:r>
+        <w:rPr>
+          <w:noProof/>
+        </w:rPr>
         <w:drawing>
           <wp:inline distT="0" distB="0" distL="0" distR="0" wp14:anchorId="7901571D" wp14:editId="1352195E">
             <wp:extent cx="5943600" cy="1635760"/>
@@ -189,6 +206,9 @@
     <w:p/>
     <w:p>
       <w:r>
+        <w:rPr>
+          <w:noProof/>
+        </w:rPr>
         <w:drawing>
           <wp:inline distT="0" distB="0" distL="0" distR="0" wp14:anchorId="06FB4201" wp14:editId="1A427E92">
             <wp:extent cx="5943600" cy="1727200"/>
@@ -228,11 +248,19 @@
     </w:p>
     <w:p>
       <w:r>
-        <w:t>This is result</w:t>
-      </w:r>
-    </w:p>
-    <w:p>
-      <w:r>
+        <w:t xml:space="preserve">This </w:t>
+      </w:r>
+      <w:proofErr w:type="gramStart"/>
+      <w:r>
+        <w:t>is result</w:t>
+      </w:r>
+      <w:proofErr w:type="gramEnd"/>
+    </w:p>
+    <w:p>
+      <w:r>
+        <w:rPr>
+          <w:noProof/>
+        </w:rPr>
         <w:lastRenderedPageBreak/>
         <w:drawing>
           <wp:inline distT="0" distB="0" distL="0" distR="0" wp14:anchorId="11023981" wp14:editId="6157AAA5">
@@ -271,6 +299,212 @@
         </w:drawing>
       </w:r>
     </w:p>
+    <w:p/>
+    <w:p/>
+    <w:p/>
+    <w:p>
+      <w:r>
+        <w:t>if ($_GET['</w:t>
+      </w:r>
+      <w:proofErr w:type="spellStart"/>
+      <w:r>
+        <w:t>it_personel</w:t>
+      </w:r>
+      <w:proofErr w:type="spellEnd"/>
+      <w:r>
+        <w:t>'</w:t>
+      </w:r>
+      <w:proofErr w:type="gramStart"/>
+      <w:r>
+        <w:t>] !</w:t>
+      </w:r>
+      <w:proofErr w:type="gramEnd"/>
+      <w:r>
+        <w:t>= "</w:t>
+      </w:r>
+      <w:proofErr w:type="gramStart"/>
+      <w:r>
+        <w:t>") {</w:t>
+      </w:r>
+      <w:proofErr w:type="gramEnd"/>
+    </w:p>
+    <w:p>
+      <w:r>
+        <w:t>    $</w:t>
+      </w:r>
+      <w:proofErr w:type="gramStart"/>
+      <w:r>
+        <w:t>statement .</w:t>
+      </w:r>
+      <w:proofErr w:type="gramEnd"/>
+      <w:r>
+        <w:t xml:space="preserve">= " and </w:t>
+      </w:r>
+      <w:proofErr w:type="spellStart"/>
+      <w:r>
+        <w:t>tbl_trouble_input.forward_logical_person</w:t>
+      </w:r>
+      <w:proofErr w:type="spellEnd"/>
+      <w:r>
+        <w:t>='$_</w:t>
+      </w:r>
+      <w:proofErr w:type="gramStart"/>
+      <w:r>
+        <w:t>GET[</w:t>
+      </w:r>
+      <w:proofErr w:type="spellStart"/>
+      <w:proofErr w:type="gramEnd"/>
+      <w:r>
+        <w:t>it_personel</w:t>
+      </w:r>
+      <w:proofErr w:type="spellEnd"/>
+      <w:r>
+        <w:t>]'";</w:t>
+      </w:r>
+    </w:p>
+    <w:p>
+      <w:r>
+        <w:t>}</w:t>
+      </w:r>
+    </w:p>
+    <w:p/>
+    <w:p/>
+    <w:p/>
+    <w:p/>
+    <w:p/>
+    <w:p/>
+    <w:p/>
+    <w:p/>
+    <w:p/>
+    <w:p/>
+    <w:p/>
+    <w:p/>
+    <w:p/>
+    <w:p>
+      <w:r>
+        <w:t>The key pages/files are therefore:</w:t>
+      </w:r>
+    </w:p>
+    <w:p>
+      <w:r>
+        <w:t>1. backend/internal/handler/</w:t>
+      </w:r>
+      <w:proofErr w:type="spellStart"/>
+      <w:proofErr w:type="gramStart"/>
+      <w:r>
+        <w:t>handlers.go</w:t>
+      </w:r>
+      <w:proofErr w:type="spellEnd"/>
+      <w:proofErr w:type="gramEnd"/>
+    </w:p>
+    <w:p>
+      <w:r>
+        <w:t xml:space="preserve">   → combined SQL filtering</w:t>
+      </w:r>
+    </w:p>
+    <w:p>
+      <w:r>
+        <w:t xml:space="preserve">   → IT Personnel list endpoint</w:t>
+      </w:r>
+    </w:p>
+    <w:p/>
+    <w:p>
+      <w:r>
+        <w:t>2. frontend/lib/</w:t>
+      </w:r>
+      <w:proofErr w:type="spellStart"/>
+      <w:r>
+        <w:t>api.ts</w:t>
+      </w:r>
+      <w:proofErr w:type="spellEnd"/>
+    </w:p>
+    <w:p>
+      <w:r>
+        <w:t xml:space="preserve">   → </w:t>
+      </w:r>
+      <w:proofErr w:type="spellStart"/>
+      <w:r>
+        <w:t>employee_id</w:t>
+      </w:r>
+      <w:proofErr w:type="spellEnd"/>
+    </w:p>
+    <w:p>
+      <w:r>
+        <w:t xml:space="preserve">   → IT Personnel endpoint/type</w:t>
+      </w:r>
+    </w:p>
+    <w:p/>
+    <w:p>
+      <w:r>
+        <w:t>3. frontend/components/data-</w:t>
+      </w:r>
+      <w:proofErr w:type="spellStart"/>
+      <w:r>
+        <w:t>table.tsx</w:t>
+      </w:r>
+      <w:proofErr w:type="spellEnd"/>
+    </w:p>
+    <w:p>
+      <w:r>
+        <w:t xml:space="preserve">   → IT Personnel searchable dropdown</w:t>
+      </w:r>
+    </w:p>
+    <w:p>
+      <w:r>
+        <w:t xml:space="preserve">   → Apply sends Date + Employee + IT Personnel + Status together</w:t>
+      </w:r>
+    </w:p>
+    <w:p/>
+    <w:p>
+      <w:r>
+        <w:t>4. frontend/app/dashboard/trouble-tickets/</w:t>
+      </w:r>
+      <w:proofErr w:type="spellStart"/>
+      <w:r>
+        <w:t>page.tsx</w:t>
+      </w:r>
+      <w:proofErr w:type="spellEnd"/>
+    </w:p>
+    <w:p>
+      <w:r>
+        <w:t xml:space="preserve">   → loads IT Personnel</w:t>
+      </w:r>
+    </w:p>
+    <w:p>
+      <w:r>
+        <w:t xml:space="preserve">   → stores combined filter state</w:t>
+      </w:r>
+    </w:p>
+    <w:p>
+      <w:r>
+        <w:t xml:space="preserve">   → sends all filters to API</w:t>
+      </w:r>
+    </w:p>
+    <w:p>
+      <w:r>
+        <w:t xml:space="preserve">You </w:t>
+      </w:r>
+      <w:r>
+        <w:rPr>
+          <w:b/>
+          <w:bCs/>
+        </w:rPr>
+        <w:t xml:space="preserve">do not need to change </w:t>
+      </w:r>
+      <w:proofErr w:type="spellStart"/>
+      <w:r>
+        <w:rPr>
+          <w:b/>
+          <w:bCs/>
+        </w:rPr>
+        <w:t>tt-columns.tsx</w:t>
+      </w:r>
+      <w:proofErr w:type="spellEnd"/>
+      <w:r>
+        <w:t xml:space="preserve"> for this filtering work.</w:t>
+      </w:r>
+    </w:p>
+    <w:p/>
     <w:sectPr>
       <w:pgSz w:w="12240" w:h="15840"/>
       <w:pgMar w:top="1440" w:right="1440" w:bottom="1440" w:left="1440" w:header="720" w:footer="720" w:gutter="0"/>
@@ -884,7 +1118,6 @@
   <w:style w:type="character" w:default="1" w:styleId="DefaultParagraphFont">
     <w:name w:val="Default Paragraph Font"/>
     <w:uiPriority w:val="1"/>
-    <w:semiHidden/>
     <w:unhideWhenUsed/>
   </w:style>
   <w:style w:type="table" w:default="1" w:styleId="TableNormal">

</xml_diff>

<commit_message>
To Add Status in Dropdown in Trouble Ticket Table
</commit_message>
<xml_diff>
--- a/document/TT_Search.docx
+++ b/document/TT_Search.docx
@@ -378,24 +378,115 @@
     <w:p/>
     <w:p/>
     <w:p/>
-    <w:p/>
-    <w:p/>
-    <w:p>
-      <w:r>
-        <w:t>The key pages/files are therefore:</w:t>
-      </w:r>
-    </w:p>
-    <w:p>
-      <w:r>
-        <w:t>1. backend/internal/handler/</w:t>
-      </w:r>
+    <w:p>
+      <w:r>
+        <w:lastRenderedPageBreak/>
+        <w:t>3. Make sure the route is registered</w:t>
+      </w:r>
+    </w:p>
+    <w:p/>
+    <w:p>
       <w:proofErr w:type="spellStart"/>
       <w:proofErr w:type="gramStart"/>
       <w:r>
-        <w:t>handlers.go</w:t>
+        <w:t>g.GET</w:t>
+      </w:r>
+      <w:proofErr w:type="spellEnd"/>
+      <w:r>
+        <w:t>(</w:t>
+      </w:r>
+      <w:proofErr w:type="gramEnd"/>
+    </w:p>
+    <w:p>
+      <w:r>
+        <w:tab/>
+        <w:t>"/trouble-tickets",</w:t>
+      </w:r>
+    </w:p>
+    <w:p>
+      <w:r>
+        <w:tab/>
+      </w:r>
+      <w:proofErr w:type="spellStart"/>
+      <w:proofErr w:type="gramStart"/>
+      <w:r>
+        <w:t>h.TroubleTicketList</w:t>
       </w:r>
       <w:proofErr w:type="spellEnd"/>
       <w:proofErr w:type="gramEnd"/>
+      <w:r>
+        <w:t>,</w:t>
+      </w:r>
+    </w:p>
+    <w:p>
+      <w:r>
+        <w:t>)</w:t>
+      </w:r>
+    </w:p>
+    <w:p/>
+    <w:p>
+      <w:proofErr w:type="spellStart"/>
+      <w:proofErr w:type="gramStart"/>
+      <w:r>
+        <w:t>g.GET</w:t>
+      </w:r>
+      <w:proofErr w:type="spellEnd"/>
+      <w:r>
+        <w:t>(</w:t>
+      </w:r>
+      <w:proofErr w:type="gramEnd"/>
+    </w:p>
+    <w:p>
+      <w:r>
+        <w:tab/>
+        <w:t>"/trouble-ticket-it-personnel",</w:t>
+      </w:r>
+    </w:p>
+    <w:p>
+      <w:r>
+        <w:tab/>
+      </w:r>
+      <w:proofErr w:type="spellStart"/>
+      <w:proofErr w:type="gramStart"/>
+      <w:r>
+        <w:t>h.TroubleTicketITPersonnel</w:t>
+      </w:r>
+      <w:proofErr w:type="spellEnd"/>
+      <w:proofErr w:type="gramEnd"/>
+      <w:r>
+        <w:t>,</w:t>
+      </w:r>
+    </w:p>
+    <w:p>
+      <w:r>
+        <w:t>)</w:t>
+      </w:r>
+    </w:p>
+    <w:p/>
+    <w:p/>
+    <w:p/>
+    <w:p/>
+    <w:p/>
+    <w:p/>
+    <w:p/>
+    <w:p/>
+    <w:p/>
+    <w:p>
+      <w:r>
+        <w:t>The key pages/files are therefore:</w:t>
+      </w:r>
+    </w:p>
+    <w:p>
+      <w:r>
+        <w:t>1. backend/internal/handler/</w:t>
+      </w:r>
+      <w:proofErr w:type="spellStart"/>
+      <w:proofErr w:type="gramStart"/>
+      <w:r>
+        <w:t>handlers.go</w:t>
+      </w:r>
+      <w:proofErr w:type="spellEnd"/>
+      <w:proofErr w:type="gramEnd"/>
     </w:p>
     <w:p>
       <w:r>
@@ -420,6 +511,7 @@
     </w:p>
     <w:p>
       <w:r>
+        <w:lastRenderedPageBreak/>
         <w:t xml:space="preserve">   → </w:t>
       </w:r>
       <w:proofErr w:type="spellStart"/>

</xml_diff>

<commit_message>
Multiple Search Working Successfully in Touble Ticket Table
</commit_message>
<xml_diff>
--- a/document/TT_Search.docx
+++ b/document/TT_Search.docx
@@ -15,13 +15,8 @@
     </w:p>
     <w:p/>
     <w:p>
-      <w:proofErr w:type="gramStart"/>
-      <w:r>
-        <w:t>date :</w:t>
-      </w:r>
-      <w:proofErr w:type="gramEnd"/>
-      <w:r>
-        <w:t xml:space="preserve"> August 11, 2026</w:t>
+      <w:r>
+        <w:t>date : August 11, 2026</w:t>
       </w:r>
     </w:p>
     <w:p/>
@@ -248,13 +243,8 @@
     </w:p>
     <w:p>
       <w:r>
-        <w:t xml:space="preserve">This </w:t>
-      </w:r>
-      <w:proofErr w:type="gramStart"/>
-      <w:r>
-        <w:t>is result</w:t>
-      </w:r>
-      <w:proofErr w:type="gramEnd"/>
+        <w:t>This is result</w:t>
+      </w:r>
     </w:p>
     <w:p>
       <w:r>
@@ -300,218 +290,180 @@
       </w:r>
     </w:p>
     <w:p/>
+    <w:p>
+      <w:pPr>
+        <w:rPr>
+          <w:b/>
+          <w:bCs/>
+          <w:sz w:val="32"/>
+          <w:szCs w:val="32"/>
+        </w:rPr>
+      </w:pPr>
+      <w:r>
+        <w:rPr>
+          <w:b/>
+          <w:bCs/>
+          <w:sz w:val="32"/>
+          <w:szCs w:val="32"/>
+        </w:rPr>
+        <w:t>Today : August 12, 2026</w:t>
+      </w:r>
+    </w:p>
+    <w:p/>
+    <w:p>
+      <w:r>
+        <w:t>if ($_GET['</w:t>
+      </w:r>
+      <w:proofErr w:type="spellStart"/>
+      <w:r>
+        <w:t>it_personel</w:t>
+      </w:r>
+      <w:proofErr w:type="spellEnd"/>
+      <w:r>
+        <w:t>'] != "") {</w:t>
+      </w:r>
+    </w:p>
+    <w:p>
+      <w:r>
+        <w:t xml:space="preserve">    $statement .= " and </w:t>
+      </w:r>
+      <w:proofErr w:type="spellStart"/>
+      <w:r>
+        <w:t>tbl_trouble_input.forward_logical_person</w:t>
+      </w:r>
+      <w:proofErr w:type="spellEnd"/>
+      <w:r>
+        <w:t>='$_GET[</w:t>
+      </w:r>
+      <w:proofErr w:type="spellStart"/>
+      <w:r>
+        <w:t>it_personel</w:t>
+      </w:r>
+      <w:proofErr w:type="spellEnd"/>
+      <w:r>
+        <w:t>]'";</w:t>
+      </w:r>
+    </w:p>
+    <w:p>
+      <w:r>
+        <w:t>}</w:t>
+      </w:r>
+    </w:p>
+    <w:p/>
+    <w:p>
+      <w:r>
+        <w:t>3. Make sure the route is registered</w:t>
+      </w:r>
+    </w:p>
+    <w:p>
+      <w:proofErr w:type="spellStart"/>
+      <w:r>
+        <w:t>g.GET</w:t>
+      </w:r>
+      <w:proofErr w:type="spellEnd"/>
+      <w:r>
+        <w:t>(</w:t>
+      </w:r>
+    </w:p>
+    <w:p>
+      <w:r>
+        <w:tab/>
+        <w:t>"/trouble-tickets",</w:t>
+      </w:r>
+    </w:p>
+    <w:p>
+      <w:r>
+        <w:tab/>
+      </w:r>
+      <w:proofErr w:type="spellStart"/>
+      <w:r>
+        <w:t>h.TroubleTicketList</w:t>
+      </w:r>
+      <w:proofErr w:type="spellEnd"/>
+      <w:r>
+        <w:t>,</w:t>
+      </w:r>
+    </w:p>
+    <w:p>
+      <w:r>
+        <w:t>)</w:t>
+      </w:r>
+    </w:p>
+    <w:p/>
+    <w:p>
+      <w:proofErr w:type="spellStart"/>
+      <w:r>
+        <w:t>g.GET</w:t>
+      </w:r>
+      <w:proofErr w:type="spellEnd"/>
+      <w:r>
+        <w:t>(</w:t>
+      </w:r>
+    </w:p>
+    <w:p>
+      <w:r>
+        <w:tab/>
+        <w:t>"/trouble-ticket-it-personnel",</w:t>
+      </w:r>
+    </w:p>
+    <w:p>
+      <w:r>
+        <w:tab/>
+      </w:r>
+      <w:proofErr w:type="spellStart"/>
+      <w:r>
+        <w:t>h.TroubleTicketITPersonnel</w:t>
+      </w:r>
+      <w:proofErr w:type="spellEnd"/>
+      <w:r>
+        <w:t>,</w:t>
+      </w:r>
+    </w:p>
+    <w:p>
+      <w:r>
+        <w:t>)</w:t>
+      </w:r>
+    </w:p>
     <w:p/>
     <w:p/>
     <w:p>
       <w:r>
-        <w:t>if ($_GET['</w:t>
+        <w:t>The key pages/files are therefore:</w:t>
+      </w:r>
+    </w:p>
+    <w:p>
+      <w:r>
+        <w:t>1. backend/internal/handler/</w:t>
       </w:r>
       <w:proofErr w:type="spellStart"/>
       <w:r>
-        <w:t>it_personel</w:t>
+        <w:t>handlers.go</w:t>
       </w:r>
       <w:proofErr w:type="spellEnd"/>
-      <w:r>
-        <w:t>'</w:t>
-      </w:r>
-      <w:proofErr w:type="gramStart"/>
-      <w:r>
-        <w:t>] !</w:t>
-      </w:r>
-      <w:proofErr w:type="gramEnd"/>
-      <w:r>
-        <w:t>= "</w:t>
-      </w:r>
-      <w:proofErr w:type="gramStart"/>
-      <w:r>
-        <w:t>") {</w:t>
-      </w:r>
-      <w:proofErr w:type="gramEnd"/>
-    </w:p>
-    <w:p>
-      <w:r>
-        <w:t>    $</w:t>
-      </w:r>
-      <w:proofErr w:type="gramStart"/>
-      <w:r>
-        <w:t>statement .</w:t>
-      </w:r>
-      <w:proofErr w:type="gramEnd"/>
-      <w:r>
-        <w:t xml:space="preserve">= " and </w:t>
+    </w:p>
+    <w:p>
+      <w:r>
+        <w:t xml:space="preserve">   → combined SQL filtering</w:t>
+      </w:r>
+    </w:p>
+    <w:p>
+      <w:r>
+        <w:t xml:space="preserve">   → IT Personnel list endpoint</w:t>
+      </w:r>
+    </w:p>
+    <w:p/>
+    <w:p>
+      <w:r>
+        <w:t>2. frontend/lib/</w:t>
       </w:r>
       <w:proofErr w:type="spellStart"/>
       <w:r>
-        <w:t>tbl_trouble_input.forward_logical_person</w:t>
+        <w:t>api.ts</w:t>
       </w:r>
       <w:proofErr w:type="spellEnd"/>
-      <w:r>
-        <w:t>='$_</w:t>
-      </w:r>
-      <w:proofErr w:type="gramStart"/>
-      <w:r>
-        <w:t>GET[</w:t>
-      </w:r>
-      <w:proofErr w:type="spellStart"/>
-      <w:proofErr w:type="gramEnd"/>
-      <w:r>
-        <w:t>it_personel</w:t>
-      </w:r>
-      <w:proofErr w:type="spellEnd"/>
-      <w:r>
-        <w:t>]'";</w:t>
-      </w:r>
-    </w:p>
-    <w:p>
-      <w:r>
-        <w:t>}</w:t>
-      </w:r>
-    </w:p>
-    <w:p/>
-    <w:p/>
-    <w:p/>
-    <w:p/>
-    <w:p/>
-    <w:p/>
-    <w:p/>
-    <w:p/>
-    <w:p/>
-    <w:p/>
-    <w:p/>
-    <w:p>
-      <w:r>
-        <w:lastRenderedPageBreak/>
-        <w:t>3. Make sure the route is registered</w:t>
-      </w:r>
-    </w:p>
-    <w:p/>
-    <w:p>
-      <w:proofErr w:type="spellStart"/>
-      <w:proofErr w:type="gramStart"/>
-      <w:r>
-        <w:t>g.GET</w:t>
-      </w:r>
-      <w:proofErr w:type="spellEnd"/>
-      <w:r>
-        <w:t>(</w:t>
-      </w:r>
-      <w:proofErr w:type="gramEnd"/>
-    </w:p>
-    <w:p>
-      <w:r>
-        <w:tab/>
-        <w:t>"/trouble-tickets",</w:t>
-      </w:r>
-    </w:p>
-    <w:p>
-      <w:r>
-        <w:tab/>
-      </w:r>
-      <w:proofErr w:type="spellStart"/>
-      <w:proofErr w:type="gramStart"/>
-      <w:r>
-        <w:t>h.TroubleTicketList</w:t>
-      </w:r>
-      <w:proofErr w:type="spellEnd"/>
-      <w:proofErr w:type="gramEnd"/>
-      <w:r>
-        <w:t>,</w:t>
-      </w:r>
-    </w:p>
-    <w:p>
-      <w:r>
-        <w:t>)</w:t>
-      </w:r>
-    </w:p>
-    <w:p/>
-    <w:p>
-      <w:proofErr w:type="spellStart"/>
-      <w:proofErr w:type="gramStart"/>
-      <w:r>
-        <w:t>g.GET</w:t>
-      </w:r>
-      <w:proofErr w:type="spellEnd"/>
-      <w:r>
-        <w:t>(</w:t>
-      </w:r>
-      <w:proofErr w:type="gramEnd"/>
-    </w:p>
-    <w:p>
-      <w:r>
-        <w:tab/>
-        <w:t>"/trouble-ticket-it-personnel",</w:t>
-      </w:r>
-    </w:p>
-    <w:p>
-      <w:r>
-        <w:tab/>
-      </w:r>
-      <w:proofErr w:type="spellStart"/>
-      <w:proofErr w:type="gramStart"/>
-      <w:r>
-        <w:t>h.TroubleTicketITPersonnel</w:t>
-      </w:r>
-      <w:proofErr w:type="spellEnd"/>
-      <w:proofErr w:type="gramEnd"/>
-      <w:r>
-        <w:t>,</w:t>
-      </w:r>
-    </w:p>
-    <w:p>
-      <w:r>
-        <w:t>)</w:t>
-      </w:r>
-    </w:p>
-    <w:p/>
-    <w:p/>
-    <w:p/>
-    <w:p/>
-    <w:p/>
-    <w:p/>
-    <w:p/>
-    <w:p/>
-    <w:p/>
-    <w:p>
-      <w:r>
-        <w:t>The key pages/files are therefore:</w:t>
-      </w:r>
-    </w:p>
-    <w:p>
-      <w:r>
-        <w:t>1. backend/internal/handler/</w:t>
-      </w:r>
-      <w:proofErr w:type="spellStart"/>
-      <w:proofErr w:type="gramStart"/>
-      <w:r>
-        <w:t>handlers.go</w:t>
-      </w:r>
-      <w:proofErr w:type="spellEnd"/>
-      <w:proofErr w:type="gramEnd"/>
-    </w:p>
-    <w:p>
-      <w:r>
-        <w:t xml:space="preserve">   → combined SQL filtering</w:t>
-      </w:r>
-    </w:p>
-    <w:p>
-      <w:r>
-        <w:t xml:space="preserve">   → IT Personnel list endpoint</w:t>
-      </w:r>
-    </w:p>
-    <w:p/>
-    <w:p>
-      <w:r>
-        <w:t>2. frontend/lib/</w:t>
-      </w:r>
-      <w:proofErr w:type="spellStart"/>
-      <w:r>
-        <w:t>api.ts</w:t>
-      </w:r>
-      <w:proofErr w:type="spellEnd"/>
-    </w:p>
-    <w:p>
-      <w:r>
-        <w:lastRenderedPageBreak/>
+    </w:p>
+    <w:p>
+      <w:r>
         <w:t xml:space="preserve">   → </w:t>
       </w:r>
       <w:proofErr w:type="spellStart"/>
@@ -596,7 +548,1380 @@
         <w:t xml:space="preserve"> for this filtering work.</w:t>
       </w:r>
     </w:p>
+    <w:p>
+      <w:pPr>
+        <w:pBdr>
+          <w:bottom w:val="single" w:sz="6" w:space="1" w:color="auto"/>
+        </w:pBdr>
+      </w:pPr>
+    </w:p>
+    <w:p>
+      <w:pPr>
+        <w:rPr>
+          <w:b/>
+          <w:bCs/>
+          <w:sz w:val="28"/>
+          <w:szCs w:val="28"/>
+        </w:rPr>
+      </w:pPr>
+    </w:p>
+    <w:p>
+      <w:r>
+        <w:rPr>
+          <w:b/>
+          <w:bCs/>
+          <w:sz w:val="28"/>
+          <w:szCs w:val="28"/>
+        </w:rPr>
+        <w:t xml:space="preserve">From date and To date for search </w:t>
+      </w:r>
+      <w:r>
+        <w:br/>
+      </w:r>
+      <w:r>
+        <w:br/>
+      </w:r>
+      <w:r>
+        <w:t xml:space="preserve">this search is not working properly and need to show from date to date after applying for </w:t>
+      </w:r>
+      <w:proofErr w:type="spellStart"/>
+      <w:r>
+        <w:t>UserX</w:t>
+      </w:r>
+      <w:proofErr w:type="spellEnd"/>
+      <w:r>
+        <w:t xml:space="preserve"> for all search field.</w:t>
+      </w:r>
+    </w:p>
     <w:p/>
+    <w:p/>
+    <w:p>
+      <w:r>
+        <w:drawing>
+          <wp:inline distT="0" distB="0" distL="0" distR="0" wp14:anchorId="081C89FD" wp14:editId="1377158E">
+            <wp:extent cx="5943600" cy="1788160"/>
+            <wp:effectExtent l="0" t="0" r="0" b="2540"/>
+            <wp:docPr id="1017854230" name="Picture 1"/>
+            <wp:cNvGraphicFramePr>
+              <a:graphicFrameLocks xmlns:a="http://schemas.openxmlformats.org/drawingml/2006/main" noChangeAspect="1"/>
+            </wp:cNvGraphicFramePr>
+            <a:graphic xmlns:a="http://schemas.openxmlformats.org/drawingml/2006/main">
+              <a:graphicData uri="http://schemas.openxmlformats.org/drawingml/2006/picture">
+                <pic:pic xmlns:pic="http://schemas.openxmlformats.org/drawingml/2006/picture">
+                  <pic:nvPicPr>
+                    <pic:cNvPr id="1017854230" name=""/>
+                    <pic:cNvPicPr/>
+                  </pic:nvPicPr>
+                  <pic:blipFill>
+                    <a:blip r:embed="rId11"/>
+                    <a:stretch>
+                      <a:fillRect/>
+                    </a:stretch>
+                  </pic:blipFill>
+                  <pic:spPr>
+                    <a:xfrm>
+                      <a:off x="0" y="0"/>
+                      <a:ext cx="5943600" cy="1788160"/>
+                    </a:xfrm>
+                    <a:prstGeom prst="rect">
+                      <a:avLst/>
+                    </a:prstGeom>
+                  </pic:spPr>
+                </pic:pic>
+              </a:graphicData>
+            </a:graphic>
+          </wp:inline>
+        </w:drawing>
+      </w:r>
+    </w:p>
+    <w:p/>
+    <w:p>
+      <w:r>
+        <w:t>May Two Data</w:t>
+      </w:r>
+    </w:p>
+    <w:p/>
+    <w:tbl>
+      <w:tblPr>
+        <w:tblW w:w="9639" w:type="dxa"/>
+        <w:tblBorders>
+          <w:top w:val="single" w:sz="2" w:space="0" w:color="auto"/>
+          <w:left w:val="single" w:sz="2" w:space="0" w:color="auto"/>
+          <w:bottom w:val="single" w:sz="2" w:space="0" w:color="auto"/>
+          <w:right w:val="single" w:sz="2" w:space="0" w:color="auto"/>
+        </w:tblBorders>
+        <w:shd w:val="clear" w:color="auto" w:fill="FFFFFF"/>
+        <w:tblCellMar>
+          <w:left w:w="0" w:type="dxa"/>
+          <w:right w:w="0" w:type="dxa"/>
+        </w:tblCellMar>
+        <w:tblLook w:val="04A0" w:firstRow="1" w:lastRow="0" w:firstColumn="1" w:lastColumn="0" w:noHBand="0" w:noVBand="1"/>
+      </w:tblPr>
+      <w:tblGrid>
+        <w:gridCol w:w="436"/>
+        <w:gridCol w:w="1778"/>
+        <w:gridCol w:w="741"/>
+        <w:gridCol w:w="1526"/>
+        <w:gridCol w:w="679"/>
+        <w:gridCol w:w="845"/>
+        <w:gridCol w:w="1045"/>
+        <w:gridCol w:w="830"/>
+        <w:gridCol w:w="973"/>
+        <w:gridCol w:w="823"/>
+      </w:tblGrid>
+      <w:tr>
+        <w:trPr>
+          <w:trHeight w:val="314"/>
+        </w:trPr>
+        <w:tc>
+          <w:tcPr>
+            <w:tcW w:w="436" w:type="dxa"/>
+            <w:tcBorders>
+              <w:top w:val="single" w:sz="2" w:space="0" w:color="E5E7EB"/>
+              <w:left w:val="single" w:sz="2" w:space="0" w:color="E5E7EB"/>
+              <w:bottom w:val="single" w:sz="2" w:space="0" w:color="E5E7EB"/>
+              <w:right w:val="single" w:sz="2" w:space="0" w:color="E5E7EB"/>
+            </w:tcBorders>
+            <w:shd w:val="clear" w:color="auto" w:fill="FFFFFF"/>
+            <w:noWrap/>
+            <w:tcMar>
+              <w:top w:w="98" w:type="dxa"/>
+              <w:left w:w="98" w:type="dxa"/>
+              <w:bottom w:w="98" w:type="dxa"/>
+              <w:right w:w="98" w:type="dxa"/>
+            </w:tcMar>
+            <w:vAlign w:val="center"/>
+            <w:hideMark/>
+          </w:tcPr>
+          <w:p>
+            <w:r>
+              <w:rPr>
+                <w:b/>
+                <w:bCs/>
+              </w:rPr>
+              <w:t>3</w:t>
+            </w:r>
+          </w:p>
+        </w:tc>
+        <w:tc>
+          <w:tcPr>
+            <w:tcW w:w="1753" w:type="dxa"/>
+            <w:tcBorders>
+              <w:top w:val="single" w:sz="2" w:space="0" w:color="E5E7EB"/>
+              <w:left w:val="single" w:sz="2" w:space="0" w:color="E5E7EB"/>
+              <w:bottom w:val="single" w:sz="2" w:space="0" w:color="E5E7EB"/>
+              <w:right w:val="single" w:sz="2" w:space="0" w:color="E5E7EB"/>
+            </w:tcBorders>
+            <w:shd w:val="clear" w:color="auto" w:fill="FFFFFF"/>
+            <w:noWrap/>
+            <w:tcMar>
+              <w:top w:w="98" w:type="dxa"/>
+              <w:left w:w="98" w:type="dxa"/>
+              <w:bottom w:w="98" w:type="dxa"/>
+              <w:right w:w="98" w:type="dxa"/>
+            </w:tcMar>
+            <w:vAlign w:val="center"/>
+            <w:hideMark/>
+          </w:tcPr>
+          <w:p>
+            <w:pPr>
+              <w:rPr>
+                <w:b/>
+                <w:bCs/>
+              </w:rPr>
+            </w:pPr>
+            <w:r>
+              <w:rPr>
+                <w:b/>
+                <w:bCs/>
+              </w:rPr>
+              <w:t>2026051929369</w:t>
+            </w:r>
+          </w:p>
+        </w:tc>
+        <w:tc>
+          <w:tcPr>
+            <w:tcW w:w="741" w:type="dxa"/>
+            <w:tcBorders>
+              <w:top w:val="single" w:sz="2" w:space="0" w:color="E5E7EB"/>
+              <w:left w:val="single" w:sz="2" w:space="0" w:color="E5E7EB"/>
+              <w:bottom w:val="single" w:sz="2" w:space="0" w:color="E5E7EB"/>
+              <w:right w:val="single" w:sz="2" w:space="0" w:color="E5E7EB"/>
+            </w:tcBorders>
+            <w:shd w:val="clear" w:color="auto" w:fill="FFFFFF"/>
+            <w:noWrap/>
+            <w:tcMar>
+              <w:top w:w="98" w:type="dxa"/>
+              <w:left w:w="98" w:type="dxa"/>
+              <w:bottom w:w="98" w:type="dxa"/>
+              <w:right w:w="98" w:type="dxa"/>
+            </w:tcMar>
+            <w:vAlign w:val="center"/>
+            <w:hideMark/>
+          </w:tcPr>
+          <w:p>
+            <w:r>
+              <w:t>02-0501</w:t>
+            </w:r>
+          </w:p>
+        </w:tc>
+        <w:tc>
+          <w:tcPr>
+            <w:tcW w:w="1526" w:type="dxa"/>
+            <w:tcBorders>
+              <w:top w:val="single" w:sz="2" w:space="0" w:color="E5E7EB"/>
+              <w:left w:val="single" w:sz="2" w:space="0" w:color="E5E7EB"/>
+              <w:bottom w:val="single" w:sz="2" w:space="0" w:color="E5E7EB"/>
+              <w:right w:val="single" w:sz="2" w:space="0" w:color="E5E7EB"/>
+            </w:tcBorders>
+            <w:shd w:val="clear" w:color="auto" w:fill="FFFFFF"/>
+            <w:noWrap/>
+            <w:tcMar>
+              <w:top w:w="98" w:type="dxa"/>
+              <w:left w:w="98" w:type="dxa"/>
+              <w:bottom w:w="98" w:type="dxa"/>
+              <w:right w:w="98" w:type="dxa"/>
+            </w:tcMar>
+            <w:vAlign w:val="center"/>
+            <w:hideMark/>
+          </w:tcPr>
+          <w:p>
+            <w:r>
+              <w:t>Test Purpose - Test Purpose</w:t>
+            </w:r>
+          </w:p>
+        </w:tc>
+        <w:tc>
+          <w:tcPr>
+            <w:tcW w:w="679" w:type="dxa"/>
+            <w:tcBorders>
+              <w:top w:val="single" w:sz="2" w:space="0" w:color="E5E7EB"/>
+              <w:left w:val="single" w:sz="2" w:space="0" w:color="E5E7EB"/>
+              <w:bottom w:val="single" w:sz="2" w:space="0" w:color="E5E7EB"/>
+              <w:right w:val="single" w:sz="2" w:space="0" w:color="E5E7EB"/>
+            </w:tcBorders>
+            <w:shd w:val="clear" w:color="auto" w:fill="FFFFFF"/>
+            <w:noWrap/>
+            <w:tcMar>
+              <w:top w:w="98" w:type="dxa"/>
+              <w:left w:w="98" w:type="dxa"/>
+              <w:bottom w:w="98" w:type="dxa"/>
+              <w:right w:w="98" w:type="dxa"/>
+            </w:tcMar>
+            <w:vAlign w:val="center"/>
+            <w:hideMark/>
+          </w:tcPr>
+          <w:p>
+            <w:r>
+              <w:rPr>
+                <w:b/>
+                <w:bCs/>
+              </w:rPr>
+              <w:t>0d 16h 54m</w:t>
+            </w:r>
+          </w:p>
+        </w:tc>
+        <w:tc>
+          <w:tcPr>
+            <w:tcW w:w="839" w:type="dxa"/>
+            <w:tcBorders>
+              <w:top w:val="single" w:sz="2" w:space="0" w:color="E5E7EB"/>
+              <w:left w:val="single" w:sz="2" w:space="0" w:color="E5E7EB"/>
+              <w:bottom w:val="single" w:sz="2" w:space="0" w:color="E5E7EB"/>
+              <w:right w:val="single" w:sz="2" w:space="0" w:color="E5E7EB"/>
+            </w:tcBorders>
+            <w:shd w:val="clear" w:color="auto" w:fill="FFFFFF"/>
+            <w:noWrap/>
+            <w:tcMar>
+              <w:top w:w="98" w:type="dxa"/>
+              <w:left w:w="98" w:type="dxa"/>
+              <w:bottom w:w="98" w:type="dxa"/>
+              <w:right w:w="98" w:type="dxa"/>
+            </w:tcMar>
+            <w:vAlign w:val="center"/>
+            <w:hideMark/>
+          </w:tcPr>
+          <w:p>
+            <w:r>
+              <w:t>Closed</w:t>
+            </w:r>
+          </w:p>
+        </w:tc>
+        <w:tc>
+          <w:tcPr>
+            <w:tcW w:w="1045" w:type="dxa"/>
+            <w:tcBorders>
+              <w:top w:val="single" w:sz="2" w:space="0" w:color="E5E7EB"/>
+              <w:left w:val="single" w:sz="2" w:space="0" w:color="E5E7EB"/>
+              <w:bottom w:val="single" w:sz="2" w:space="0" w:color="E5E7EB"/>
+              <w:right w:val="single" w:sz="2" w:space="0" w:color="E5E7EB"/>
+            </w:tcBorders>
+            <w:shd w:val="clear" w:color="auto" w:fill="FFFFFF"/>
+            <w:noWrap/>
+            <w:tcMar>
+              <w:top w:w="98" w:type="dxa"/>
+              <w:left w:w="98" w:type="dxa"/>
+              <w:bottom w:w="98" w:type="dxa"/>
+              <w:right w:w="98" w:type="dxa"/>
+            </w:tcMar>
+            <w:vAlign w:val="center"/>
+            <w:hideMark/>
+          </w:tcPr>
+          <w:p>
+            <w:r>
+              <w:t>—</w:t>
+            </w:r>
+          </w:p>
+        </w:tc>
+        <w:tc>
+          <w:tcPr>
+            <w:tcW w:w="830" w:type="dxa"/>
+            <w:tcBorders>
+              <w:top w:val="single" w:sz="2" w:space="0" w:color="E5E7EB"/>
+              <w:left w:val="single" w:sz="2" w:space="0" w:color="E5E7EB"/>
+              <w:bottom w:val="single" w:sz="2" w:space="0" w:color="E5E7EB"/>
+              <w:right w:val="single" w:sz="2" w:space="0" w:color="E5E7EB"/>
+            </w:tcBorders>
+            <w:shd w:val="clear" w:color="auto" w:fill="FFFFFF"/>
+            <w:noWrap/>
+            <w:tcMar>
+              <w:top w:w="98" w:type="dxa"/>
+              <w:left w:w="98" w:type="dxa"/>
+              <w:bottom w:w="98" w:type="dxa"/>
+              <w:right w:w="98" w:type="dxa"/>
+            </w:tcMar>
+            <w:vAlign w:val="center"/>
+            <w:hideMark/>
+          </w:tcPr>
+          <w:p>
+            <w:r>
+              <w:t>—</w:t>
+            </w:r>
+          </w:p>
+        </w:tc>
+        <w:tc>
+          <w:tcPr>
+            <w:tcW w:w="973" w:type="dxa"/>
+            <w:tcBorders>
+              <w:top w:val="single" w:sz="2" w:space="0" w:color="E5E7EB"/>
+              <w:left w:val="single" w:sz="2" w:space="0" w:color="E5E7EB"/>
+              <w:bottom w:val="single" w:sz="2" w:space="0" w:color="E5E7EB"/>
+              <w:right w:val="single" w:sz="2" w:space="0" w:color="E5E7EB"/>
+            </w:tcBorders>
+            <w:shd w:val="clear" w:color="auto" w:fill="FFFFFF"/>
+            <w:noWrap/>
+            <w:tcMar>
+              <w:top w:w="98" w:type="dxa"/>
+              <w:left w:w="98" w:type="dxa"/>
+              <w:bottom w:w="98" w:type="dxa"/>
+              <w:right w:w="98" w:type="dxa"/>
+            </w:tcMar>
+            <w:vAlign w:val="center"/>
+            <w:hideMark/>
+          </w:tcPr>
+          <w:p>
+            <w:r>
+              <w:t>19 May 26, 05:54 pm</w:t>
+            </w:r>
+          </w:p>
+        </w:tc>
+        <w:tc>
+          <w:tcPr>
+            <w:tcW w:w="817" w:type="dxa"/>
+            <w:tcBorders>
+              <w:top w:val="single" w:sz="2" w:space="0" w:color="E5E7EB"/>
+              <w:left w:val="single" w:sz="2" w:space="0" w:color="E5E7EB"/>
+              <w:bottom w:val="single" w:sz="2" w:space="0" w:color="E5E7EB"/>
+              <w:right w:val="single" w:sz="2" w:space="0" w:color="E5E7EB"/>
+            </w:tcBorders>
+            <w:shd w:val="clear" w:color="auto" w:fill="FFFFFF"/>
+            <w:noWrap/>
+            <w:tcMar>
+              <w:top w:w="98" w:type="dxa"/>
+              <w:left w:w="98" w:type="dxa"/>
+              <w:bottom w:w="98" w:type="dxa"/>
+              <w:right w:w="98" w:type="dxa"/>
+            </w:tcMar>
+            <w:vAlign w:val="center"/>
+            <w:hideMark/>
+          </w:tcPr>
+          <w:p>
+            <w:r>
+              <w:t>Action</w:t>
+            </w:r>
+          </w:p>
+        </w:tc>
+      </w:tr>
+      <w:tr>
+        <w:trPr>
+          <w:trHeight w:val="314"/>
+        </w:trPr>
+        <w:tc>
+          <w:tcPr>
+            <w:tcW w:w="436" w:type="dxa"/>
+            <w:tcBorders>
+              <w:top w:val="single" w:sz="2" w:space="0" w:color="E5E7EB"/>
+              <w:left w:val="single" w:sz="2" w:space="0" w:color="E5E7EB"/>
+              <w:bottom w:val="single" w:sz="2" w:space="0" w:color="E5E7EB"/>
+              <w:right w:val="single" w:sz="2" w:space="0" w:color="E5E7EB"/>
+            </w:tcBorders>
+            <w:shd w:val="clear" w:color="auto" w:fill="FFFFFF"/>
+            <w:noWrap/>
+            <w:tcMar>
+              <w:top w:w="98" w:type="dxa"/>
+              <w:left w:w="98" w:type="dxa"/>
+              <w:bottom w:w="98" w:type="dxa"/>
+              <w:right w:w="98" w:type="dxa"/>
+            </w:tcMar>
+            <w:vAlign w:val="center"/>
+            <w:hideMark/>
+          </w:tcPr>
+          <w:p>
+            <w:r>
+              <w:rPr>
+                <w:b/>
+                <w:bCs/>
+              </w:rPr>
+              <w:t>4</w:t>
+            </w:r>
+          </w:p>
+        </w:tc>
+        <w:tc>
+          <w:tcPr>
+            <w:tcW w:w="1753" w:type="dxa"/>
+            <w:tcBorders>
+              <w:top w:val="single" w:sz="2" w:space="0" w:color="E5E7EB"/>
+              <w:left w:val="single" w:sz="2" w:space="0" w:color="E5E7EB"/>
+              <w:bottom w:val="single" w:sz="2" w:space="0" w:color="E5E7EB"/>
+              <w:right w:val="single" w:sz="2" w:space="0" w:color="E5E7EB"/>
+            </w:tcBorders>
+            <w:shd w:val="clear" w:color="auto" w:fill="FFFFFF"/>
+            <w:noWrap/>
+            <w:tcMar>
+              <w:top w:w="98" w:type="dxa"/>
+              <w:left w:w="98" w:type="dxa"/>
+              <w:bottom w:w="98" w:type="dxa"/>
+              <w:right w:w="98" w:type="dxa"/>
+            </w:tcMar>
+            <w:vAlign w:val="center"/>
+            <w:hideMark/>
+          </w:tcPr>
+          <w:p>
+            <w:pPr>
+              <w:rPr>
+                <w:b/>
+                <w:bCs/>
+              </w:rPr>
+            </w:pPr>
+            <w:r>
+              <w:rPr>
+                <w:b/>
+                <w:bCs/>
+              </w:rPr>
+              <w:t>2026051729351</w:t>
+            </w:r>
+          </w:p>
+        </w:tc>
+        <w:tc>
+          <w:tcPr>
+            <w:tcW w:w="741" w:type="dxa"/>
+            <w:tcBorders>
+              <w:top w:val="single" w:sz="2" w:space="0" w:color="E5E7EB"/>
+              <w:left w:val="single" w:sz="2" w:space="0" w:color="E5E7EB"/>
+              <w:bottom w:val="single" w:sz="2" w:space="0" w:color="E5E7EB"/>
+              <w:right w:val="single" w:sz="2" w:space="0" w:color="E5E7EB"/>
+            </w:tcBorders>
+            <w:shd w:val="clear" w:color="auto" w:fill="FFFFFF"/>
+            <w:noWrap/>
+            <w:tcMar>
+              <w:top w:w="98" w:type="dxa"/>
+              <w:left w:w="98" w:type="dxa"/>
+              <w:bottom w:w="98" w:type="dxa"/>
+              <w:right w:w="98" w:type="dxa"/>
+            </w:tcMar>
+            <w:vAlign w:val="center"/>
+            <w:hideMark/>
+          </w:tcPr>
+          <w:p>
+            <w:r>
+              <w:t>02-0501</w:t>
+            </w:r>
+          </w:p>
+        </w:tc>
+        <w:tc>
+          <w:tcPr>
+            <w:tcW w:w="1526" w:type="dxa"/>
+            <w:tcBorders>
+              <w:top w:val="single" w:sz="2" w:space="0" w:color="E5E7EB"/>
+              <w:left w:val="single" w:sz="2" w:space="0" w:color="E5E7EB"/>
+              <w:bottom w:val="single" w:sz="2" w:space="0" w:color="E5E7EB"/>
+              <w:right w:val="single" w:sz="2" w:space="0" w:color="E5E7EB"/>
+            </w:tcBorders>
+            <w:shd w:val="clear" w:color="auto" w:fill="FFFFFF"/>
+            <w:noWrap/>
+            <w:tcMar>
+              <w:top w:w="98" w:type="dxa"/>
+              <w:left w:w="98" w:type="dxa"/>
+              <w:bottom w:w="98" w:type="dxa"/>
+              <w:right w:w="98" w:type="dxa"/>
+            </w:tcMar>
+            <w:vAlign w:val="center"/>
+            <w:hideMark/>
+          </w:tcPr>
+          <w:p>
+            <w:r>
+              <w:t>Test Purpose - Test Purpose</w:t>
+            </w:r>
+          </w:p>
+        </w:tc>
+        <w:tc>
+          <w:tcPr>
+            <w:tcW w:w="679" w:type="dxa"/>
+            <w:tcBorders>
+              <w:top w:val="single" w:sz="2" w:space="0" w:color="E5E7EB"/>
+              <w:left w:val="single" w:sz="2" w:space="0" w:color="E5E7EB"/>
+              <w:bottom w:val="single" w:sz="2" w:space="0" w:color="E5E7EB"/>
+              <w:right w:val="single" w:sz="2" w:space="0" w:color="E5E7EB"/>
+            </w:tcBorders>
+            <w:shd w:val="clear" w:color="auto" w:fill="FFFFFF"/>
+            <w:noWrap/>
+            <w:tcMar>
+              <w:top w:w="98" w:type="dxa"/>
+              <w:left w:w="98" w:type="dxa"/>
+              <w:bottom w:w="98" w:type="dxa"/>
+              <w:right w:w="98" w:type="dxa"/>
+            </w:tcMar>
+            <w:vAlign w:val="center"/>
+            <w:hideMark/>
+          </w:tcPr>
+          <w:p>
+            <w:r>
+              <w:rPr>
+                <w:b/>
+                <w:bCs/>
+              </w:rPr>
+              <w:t>17d 23h 50m</w:t>
+            </w:r>
+          </w:p>
+        </w:tc>
+        <w:tc>
+          <w:tcPr>
+            <w:tcW w:w="839" w:type="dxa"/>
+            <w:tcBorders>
+              <w:top w:val="single" w:sz="2" w:space="0" w:color="E5E7EB"/>
+              <w:left w:val="single" w:sz="2" w:space="0" w:color="E5E7EB"/>
+              <w:bottom w:val="single" w:sz="2" w:space="0" w:color="E5E7EB"/>
+              <w:right w:val="single" w:sz="2" w:space="0" w:color="E5E7EB"/>
+            </w:tcBorders>
+            <w:shd w:val="clear" w:color="auto" w:fill="FFFFFF"/>
+            <w:noWrap/>
+            <w:tcMar>
+              <w:top w:w="98" w:type="dxa"/>
+              <w:left w:w="98" w:type="dxa"/>
+              <w:bottom w:w="98" w:type="dxa"/>
+              <w:right w:w="98" w:type="dxa"/>
+            </w:tcMar>
+            <w:vAlign w:val="center"/>
+            <w:hideMark/>
+          </w:tcPr>
+          <w:p>
+            <w:r>
+              <w:t>Closed</w:t>
+            </w:r>
+          </w:p>
+        </w:tc>
+        <w:tc>
+          <w:tcPr>
+            <w:tcW w:w="1045" w:type="dxa"/>
+            <w:tcBorders>
+              <w:top w:val="single" w:sz="2" w:space="0" w:color="E5E7EB"/>
+              <w:left w:val="single" w:sz="2" w:space="0" w:color="E5E7EB"/>
+              <w:bottom w:val="single" w:sz="2" w:space="0" w:color="E5E7EB"/>
+              <w:right w:val="single" w:sz="2" w:space="0" w:color="E5E7EB"/>
+            </w:tcBorders>
+            <w:shd w:val="clear" w:color="auto" w:fill="FFFFFF"/>
+            <w:noWrap/>
+            <w:tcMar>
+              <w:top w:w="98" w:type="dxa"/>
+              <w:left w:w="98" w:type="dxa"/>
+              <w:bottom w:w="98" w:type="dxa"/>
+              <w:right w:w="98" w:type="dxa"/>
+            </w:tcMar>
+            <w:vAlign w:val="center"/>
+            <w:hideMark/>
+          </w:tcPr>
+          <w:p>
+            <w:r>
+              <w:t>—</w:t>
+            </w:r>
+          </w:p>
+        </w:tc>
+        <w:tc>
+          <w:tcPr>
+            <w:tcW w:w="830" w:type="dxa"/>
+            <w:tcBorders>
+              <w:top w:val="single" w:sz="2" w:space="0" w:color="E5E7EB"/>
+              <w:left w:val="single" w:sz="2" w:space="0" w:color="E5E7EB"/>
+              <w:bottom w:val="single" w:sz="2" w:space="0" w:color="E5E7EB"/>
+              <w:right w:val="single" w:sz="2" w:space="0" w:color="E5E7EB"/>
+            </w:tcBorders>
+            <w:shd w:val="clear" w:color="auto" w:fill="FFFFFF"/>
+            <w:noWrap/>
+            <w:tcMar>
+              <w:top w:w="98" w:type="dxa"/>
+              <w:left w:w="98" w:type="dxa"/>
+              <w:bottom w:w="98" w:type="dxa"/>
+              <w:right w:w="98" w:type="dxa"/>
+            </w:tcMar>
+            <w:vAlign w:val="center"/>
+            <w:hideMark/>
+          </w:tcPr>
+          <w:p>
+            <w:r>
+              <w:t>—</w:t>
+            </w:r>
+          </w:p>
+        </w:tc>
+        <w:tc>
+          <w:tcPr>
+            <w:tcW w:w="973" w:type="dxa"/>
+            <w:tcBorders>
+              <w:top w:val="single" w:sz="2" w:space="0" w:color="E5E7EB"/>
+              <w:left w:val="single" w:sz="2" w:space="0" w:color="E5E7EB"/>
+              <w:bottom w:val="single" w:sz="2" w:space="0" w:color="E5E7EB"/>
+              <w:right w:val="single" w:sz="2" w:space="0" w:color="E5E7EB"/>
+            </w:tcBorders>
+            <w:shd w:val="clear" w:color="auto" w:fill="FFFFFF"/>
+            <w:noWrap/>
+            <w:tcMar>
+              <w:top w:w="98" w:type="dxa"/>
+              <w:left w:w="98" w:type="dxa"/>
+              <w:bottom w:w="98" w:type="dxa"/>
+              <w:right w:w="98" w:type="dxa"/>
+            </w:tcMar>
+            <w:vAlign w:val="center"/>
+            <w:hideMark/>
+          </w:tcPr>
+          <w:p>
+            <w:r>
+              <w:t>17 May 26, 04:45 pm</w:t>
+            </w:r>
+          </w:p>
+        </w:tc>
+        <w:tc>
+          <w:tcPr>
+            <w:tcW w:w="817" w:type="dxa"/>
+            <w:tcBorders>
+              <w:top w:val="single" w:sz="2" w:space="0" w:color="E5E7EB"/>
+              <w:left w:val="single" w:sz="2" w:space="0" w:color="E5E7EB"/>
+              <w:bottom w:val="single" w:sz="2" w:space="0" w:color="E5E7EB"/>
+              <w:right w:val="single" w:sz="2" w:space="0" w:color="E5E7EB"/>
+            </w:tcBorders>
+            <w:shd w:val="clear" w:color="auto" w:fill="FFFFFF"/>
+            <w:noWrap/>
+            <w:tcMar>
+              <w:top w:w="98" w:type="dxa"/>
+              <w:left w:w="98" w:type="dxa"/>
+              <w:bottom w:w="98" w:type="dxa"/>
+              <w:right w:w="98" w:type="dxa"/>
+            </w:tcMar>
+            <w:vAlign w:val="center"/>
+            <w:hideMark/>
+          </w:tcPr>
+          <w:p>
+            <w:r>
+              <w:t>Action</w:t>
+            </w:r>
+          </w:p>
+        </w:tc>
+      </w:tr>
+    </w:tbl>
+    <w:p/>
+    <w:p/>
+    <w:tbl>
+      <w:tblPr>
+        <w:tblW w:w="9788" w:type="dxa"/>
+        <w:tblBorders>
+          <w:top w:val="single" w:sz="2" w:space="0" w:color="auto"/>
+          <w:left w:val="single" w:sz="2" w:space="0" w:color="auto"/>
+          <w:bottom w:val="single" w:sz="2" w:space="0" w:color="auto"/>
+          <w:right w:val="single" w:sz="2" w:space="0" w:color="auto"/>
+        </w:tblBorders>
+        <w:shd w:val="clear" w:color="auto" w:fill="FFFFFF"/>
+        <w:tblCellMar>
+          <w:left w:w="0" w:type="dxa"/>
+          <w:right w:w="0" w:type="dxa"/>
+        </w:tblCellMar>
+        <w:tblLook w:val="04A0" w:firstRow="1" w:lastRow="0" w:firstColumn="1" w:lastColumn="0" w:noHBand="0" w:noVBand="1"/>
+      </w:tblPr>
+      <w:tblGrid>
+        <w:gridCol w:w="446"/>
+        <w:gridCol w:w="1778"/>
+        <w:gridCol w:w="763"/>
+        <w:gridCol w:w="1584"/>
+        <w:gridCol w:w="697"/>
+        <w:gridCol w:w="845"/>
+        <w:gridCol w:w="1080"/>
+        <w:gridCol w:w="1125"/>
+        <w:gridCol w:w="1005"/>
+        <w:gridCol w:w="823"/>
+      </w:tblGrid>
+      <w:tr>
+        <w:trPr>
+          <w:trHeight w:val="277"/>
+        </w:trPr>
+        <w:tc>
+          <w:tcPr>
+            <w:tcW w:w="446" w:type="dxa"/>
+            <w:tcBorders>
+              <w:top w:val="single" w:sz="2" w:space="0" w:color="E5E7EB"/>
+              <w:left w:val="single" w:sz="2" w:space="0" w:color="E5E7EB"/>
+              <w:bottom w:val="single" w:sz="2" w:space="0" w:color="E5E7EB"/>
+              <w:right w:val="single" w:sz="2" w:space="0" w:color="E5E7EB"/>
+            </w:tcBorders>
+            <w:shd w:val="clear" w:color="auto" w:fill="FFFFFF"/>
+            <w:noWrap/>
+            <w:tcMar>
+              <w:top w:w="98" w:type="dxa"/>
+              <w:left w:w="98" w:type="dxa"/>
+              <w:bottom w:w="98" w:type="dxa"/>
+              <w:right w:w="98" w:type="dxa"/>
+            </w:tcMar>
+            <w:vAlign w:val="center"/>
+            <w:hideMark/>
+          </w:tcPr>
+          <w:p>
+            <w:r>
+              <w:rPr>
+                <w:b/>
+                <w:bCs/>
+              </w:rPr>
+              <w:t>1</w:t>
+            </w:r>
+          </w:p>
+        </w:tc>
+        <w:tc>
+          <w:tcPr>
+            <w:tcW w:w="1639" w:type="dxa"/>
+            <w:tcBorders>
+              <w:top w:val="single" w:sz="2" w:space="0" w:color="E5E7EB"/>
+              <w:left w:val="single" w:sz="2" w:space="0" w:color="E5E7EB"/>
+              <w:bottom w:val="single" w:sz="2" w:space="0" w:color="E5E7EB"/>
+              <w:right w:val="single" w:sz="2" w:space="0" w:color="E5E7EB"/>
+            </w:tcBorders>
+            <w:shd w:val="clear" w:color="auto" w:fill="FFFFFF"/>
+            <w:noWrap/>
+            <w:tcMar>
+              <w:top w:w="98" w:type="dxa"/>
+              <w:left w:w="98" w:type="dxa"/>
+              <w:bottom w:w="98" w:type="dxa"/>
+              <w:right w:w="98" w:type="dxa"/>
+            </w:tcMar>
+            <w:vAlign w:val="center"/>
+            <w:hideMark/>
+          </w:tcPr>
+          <w:p>
+            <w:pPr>
+              <w:rPr>
+                <w:b/>
+                <w:bCs/>
+              </w:rPr>
+            </w:pPr>
+            <w:r>
+              <w:rPr>
+                <w:b/>
+                <w:bCs/>
+              </w:rPr>
+              <w:t>2026072229730</w:t>
+            </w:r>
+          </w:p>
+        </w:tc>
+        <w:tc>
+          <w:tcPr>
+            <w:tcW w:w="763" w:type="dxa"/>
+            <w:tcBorders>
+              <w:top w:val="single" w:sz="2" w:space="0" w:color="E5E7EB"/>
+              <w:left w:val="single" w:sz="2" w:space="0" w:color="E5E7EB"/>
+              <w:bottom w:val="single" w:sz="2" w:space="0" w:color="E5E7EB"/>
+              <w:right w:val="single" w:sz="2" w:space="0" w:color="E5E7EB"/>
+            </w:tcBorders>
+            <w:shd w:val="clear" w:color="auto" w:fill="FFFFFF"/>
+            <w:noWrap/>
+            <w:tcMar>
+              <w:top w:w="98" w:type="dxa"/>
+              <w:left w:w="98" w:type="dxa"/>
+              <w:bottom w:w="98" w:type="dxa"/>
+              <w:right w:w="98" w:type="dxa"/>
+            </w:tcMar>
+            <w:vAlign w:val="center"/>
+            <w:hideMark/>
+          </w:tcPr>
+          <w:p>
+            <w:r>
+              <w:t>02-0501</w:t>
+            </w:r>
+          </w:p>
+        </w:tc>
+        <w:tc>
+          <w:tcPr>
+            <w:tcW w:w="1584" w:type="dxa"/>
+            <w:tcBorders>
+              <w:top w:val="single" w:sz="2" w:space="0" w:color="E5E7EB"/>
+              <w:left w:val="single" w:sz="2" w:space="0" w:color="E5E7EB"/>
+              <w:bottom w:val="single" w:sz="2" w:space="0" w:color="E5E7EB"/>
+              <w:right w:val="single" w:sz="2" w:space="0" w:color="E5E7EB"/>
+            </w:tcBorders>
+            <w:shd w:val="clear" w:color="auto" w:fill="FFFFFF"/>
+            <w:noWrap/>
+            <w:tcMar>
+              <w:top w:w="98" w:type="dxa"/>
+              <w:left w:w="98" w:type="dxa"/>
+              <w:bottom w:w="98" w:type="dxa"/>
+              <w:right w:w="98" w:type="dxa"/>
+            </w:tcMar>
+            <w:vAlign w:val="center"/>
+            <w:hideMark/>
+          </w:tcPr>
+          <w:p>
+            <w:r>
+              <w:t>Test Purpose - Test Purpose</w:t>
+            </w:r>
+          </w:p>
+        </w:tc>
+        <w:tc>
+          <w:tcPr>
+            <w:tcW w:w="697" w:type="dxa"/>
+            <w:tcBorders>
+              <w:top w:val="single" w:sz="2" w:space="0" w:color="E5E7EB"/>
+              <w:left w:val="single" w:sz="2" w:space="0" w:color="E5E7EB"/>
+              <w:bottom w:val="single" w:sz="2" w:space="0" w:color="E5E7EB"/>
+              <w:right w:val="single" w:sz="2" w:space="0" w:color="E5E7EB"/>
+            </w:tcBorders>
+            <w:shd w:val="clear" w:color="auto" w:fill="FFFFFF"/>
+            <w:noWrap/>
+            <w:tcMar>
+              <w:top w:w="98" w:type="dxa"/>
+              <w:left w:w="98" w:type="dxa"/>
+              <w:bottom w:w="98" w:type="dxa"/>
+              <w:right w:w="98" w:type="dxa"/>
+            </w:tcMar>
+            <w:vAlign w:val="center"/>
+            <w:hideMark/>
+          </w:tcPr>
+          <w:p>
+            <w:r>
+              <w:rPr>
+                <w:b/>
+                <w:bCs/>
+              </w:rPr>
+              <w:t>0d 22h 1m</w:t>
+            </w:r>
+          </w:p>
+        </w:tc>
+        <w:tc>
+          <w:tcPr>
+            <w:tcW w:w="779" w:type="dxa"/>
+            <w:tcBorders>
+              <w:top w:val="single" w:sz="2" w:space="0" w:color="E5E7EB"/>
+              <w:left w:val="single" w:sz="2" w:space="0" w:color="E5E7EB"/>
+              <w:bottom w:val="single" w:sz="2" w:space="0" w:color="E5E7EB"/>
+              <w:right w:val="single" w:sz="2" w:space="0" w:color="E5E7EB"/>
+            </w:tcBorders>
+            <w:shd w:val="clear" w:color="auto" w:fill="FFFFFF"/>
+            <w:noWrap/>
+            <w:tcMar>
+              <w:top w:w="98" w:type="dxa"/>
+              <w:left w:w="98" w:type="dxa"/>
+              <w:bottom w:w="98" w:type="dxa"/>
+              <w:right w:w="98" w:type="dxa"/>
+            </w:tcMar>
+            <w:vAlign w:val="center"/>
+            <w:hideMark/>
+          </w:tcPr>
+          <w:p>
+            <w:r>
+              <w:t>Closed</w:t>
+            </w:r>
+          </w:p>
+        </w:tc>
+        <w:tc>
+          <w:tcPr>
+            <w:tcW w:w="1080" w:type="dxa"/>
+            <w:tcBorders>
+              <w:top w:val="single" w:sz="2" w:space="0" w:color="E5E7EB"/>
+              <w:left w:val="single" w:sz="2" w:space="0" w:color="E5E7EB"/>
+              <w:bottom w:val="single" w:sz="2" w:space="0" w:color="E5E7EB"/>
+              <w:right w:val="single" w:sz="2" w:space="0" w:color="E5E7EB"/>
+            </w:tcBorders>
+            <w:shd w:val="clear" w:color="auto" w:fill="FFFFFF"/>
+            <w:noWrap/>
+            <w:tcMar>
+              <w:top w:w="98" w:type="dxa"/>
+              <w:left w:w="98" w:type="dxa"/>
+              <w:bottom w:w="98" w:type="dxa"/>
+              <w:right w:w="98" w:type="dxa"/>
+            </w:tcMar>
+            <w:vAlign w:val="center"/>
+            <w:hideMark/>
+          </w:tcPr>
+          <w:p>
+            <w:r>
+              <w:t>Petty Cash</w:t>
+            </w:r>
+          </w:p>
+        </w:tc>
+        <w:tc>
+          <w:tcPr>
+            <w:tcW w:w="1037" w:type="dxa"/>
+            <w:tcBorders>
+              <w:top w:val="single" w:sz="2" w:space="0" w:color="E5E7EB"/>
+              <w:left w:val="single" w:sz="2" w:space="0" w:color="E5E7EB"/>
+              <w:bottom w:val="single" w:sz="2" w:space="0" w:color="E5E7EB"/>
+              <w:right w:val="single" w:sz="2" w:space="0" w:color="E5E7EB"/>
+            </w:tcBorders>
+            <w:shd w:val="clear" w:color="auto" w:fill="FFFFFF"/>
+            <w:noWrap/>
+            <w:tcMar>
+              <w:top w:w="98" w:type="dxa"/>
+              <w:left w:w="98" w:type="dxa"/>
+              <w:bottom w:w="98" w:type="dxa"/>
+              <w:right w:w="98" w:type="dxa"/>
+            </w:tcMar>
+            <w:vAlign w:val="center"/>
+            <w:hideMark/>
+          </w:tcPr>
+          <w:p>
+            <w:r>
+              <w:t>Delivered</w:t>
+            </w:r>
+          </w:p>
+        </w:tc>
+        <w:tc>
+          <w:tcPr>
+            <w:tcW w:w="1005" w:type="dxa"/>
+            <w:tcBorders>
+              <w:top w:val="single" w:sz="2" w:space="0" w:color="E5E7EB"/>
+              <w:left w:val="single" w:sz="2" w:space="0" w:color="E5E7EB"/>
+              <w:bottom w:val="single" w:sz="2" w:space="0" w:color="E5E7EB"/>
+              <w:right w:val="single" w:sz="2" w:space="0" w:color="E5E7EB"/>
+            </w:tcBorders>
+            <w:shd w:val="clear" w:color="auto" w:fill="FFFFFF"/>
+            <w:noWrap/>
+            <w:tcMar>
+              <w:top w:w="98" w:type="dxa"/>
+              <w:left w:w="98" w:type="dxa"/>
+              <w:bottom w:w="98" w:type="dxa"/>
+              <w:right w:w="98" w:type="dxa"/>
+            </w:tcMar>
+            <w:vAlign w:val="center"/>
+            <w:hideMark/>
+          </w:tcPr>
+          <w:p>
+            <w:r>
+              <w:t>22 Jul 26, 06:39 pm</w:t>
+            </w:r>
+          </w:p>
+        </w:tc>
+        <w:tc>
+          <w:tcPr>
+            <w:tcW w:w="758" w:type="dxa"/>
+            <w:tcBorders>
+              <w:top w:val="single" w:sz="2" w:space="0" w:color="E5E7EB"/>
+              <w:left w:val="single" w:sz="2" w:space="0" w:color="E5E7EB"/>
+              <w:bottom w:val="single" w:sz="2" w:space="0" w:color="E5E7EB"/>
+              <w:right w:val="single" w:sz="2" w:space="0" w:color="E5E7EB"/>
+            </w:tcBorders>
+            <w:shd w:val="clear" w:color="auto" w:fill="FFFFFF"/>
+            <w:noWrap/>
+            <w:tcMar>
+              <w:top w:w="98" w:type="dxa"/>
+              <w:left w:w="98" w:type="dxa"/>
+              <w:bottom w:w="98" w:type="dxa"/>
+              <w:right w:w="98" w:type="dxa"/>
+            </w:tcMar>
+            <w:vAlign w:val="center"/>
+            <w:hideMark/>
+          </w:tcPr>
+          <w:p>
+            <w:r>
+              <w:t>Action</w:t>
+            </w:r>
+          </w:p>
+        </w:tc>
+      </w:tr>
+      <w:tr>
+        <w:trPr>
+          <w:trHeight w:val="277"/>
+        </w:trPr>
+        <w:tc>
+          <w:tcPr>
+            <w:tcW w:w="446" w:type="dxa"/>
+            <w:tcBorders>
+              <w:top w:val="single" w:sz="2" w:space="0" w:color="E5E7EB"/>
+              <w:left w:val="single" w:sz="2" w:space="0" w:color="E5E7EB"/>
+              <w:bottom w:val="single" w:sz="2" w:space="0" w:color="E5E7EB"/>
+              <w:right w:val="single" w:sz="2" w:space="0" w:color="E5E7EB"/>
+            </w:tcBorders>
+            <w:shd w:val="clear" w:color="auto" w:fill="FFFFFF"/>
+            <w:noWrap/>
+            <w:tcMar>
+              <w:top w:w="98" w:type="dxa"/>
+              <w:left w:w="98" w:type="dxa"/>
+              <w:bottom w:w="98" w:type="dxa"/>
+              <w:right w:w="98" w:type="dxa"/>
+            </w:tcMar>
+            <w:vAlign w:val="center"/>
+            <w:hideMark/>
+          </w:tcPr>
+          <w:p>
+            <w:r>
+              <w:rPr>
+                <w:b/>
+                <w:bCs/>
+              </w:rPr>
+              <w:t>2</w:t>
+            </w:r>
+          </w:p>
+        </w:tc>
+        <w:tc>
+          <w:tcPr>
+            <w:tcW w:w="1639" w:type="dxa"/>
+            <w:tcBorders>
+              <w:top w:val="single" w:sz="2" w:space="0" w:color="E5E7EB"/>
+              <w:left w:val="single" w:sz="2" w:space="0" w:color="E5E7EB"/>
+              <w:bottom w:val="single" w:sz="2" w:space="0" w:color="E5E7EB"/>
+              <w:right w:val="single" w:sz="2" w:space="0" w:color="E5E7EB"/>
+            </w:tcBorders>
+            <w:shd w:val="clear" w:color="auto" w:fill="FFFFFF"/>
+            <w:noWrap/>
+            <w:tcMar>
+              <w:top w:w="98" w:type="dxa"/>
+              <w:left w:w="98" w:type="dxa"/>
+              <w:bottom w:w="98" w:type="dxa"/>
+              <w:right w:w="98" w:type="dxa"/>
+            </w:tcMar>
+            <w:vAlign w:val="center"/>
+            <w:hideMark/>
+          </w:tcPr>
+          <w:p>
+            <w:pPr>
+              <w:rPr>
+                <w:b/>
+                <w:bCs/>
+              </w:rPr>
+            </w:pPr>
+            <w:r>
+              <w:rPr>
+                <w:b/>
+                <w:bCs/>
+              </w:rPr>
+              <w:t>2026072229729</w:t>
+            </w:r>
+          </w:p>
+        </w:tc>
+        <w:tc>
+          <w:tcPr>
+            <w:tcW w:w="763" w:type="dxa"/>
+            <w:tcBorders>
+              <w:top w:val="single" w:sz="2" w:space="0" w:color="E5E7EB"/>
+              <w:left w:val="single" w:sz="2" w:space="0" w:color="E5E7EB"/>
+              <w:bottom w:val="single" w:sz="2" w:space="0" w:color="E5E7EB"/>
+              <w:right w:val="single" w:sz="2" w:space="0" w:color="E5E7EB"/>
+            </w:tcBorders>
+            <w:shd w:val="clear" w:color="auto" w:fill="FFFFFF"/>
+            <w:noWrap/>
+            <w:tcMar>
+              <w:top w:w="98" w:type="dxa"/>
+              <w:left w:w="98" w:type="dxa"/>
+              <w:bottom w:w="98" w:type="dxa"/>
+              <w:right w:w="98" w:type="dxa"/>
+            </w:tcMar>
+            <w:vAlign w:val="center"/>
+            <w:hideMark/>
+          </w:tcPr>
+          <w:p>
+            <w:r>
+              <w:t>02-0501</w:t>
+            </w:r>
+          </w:p>
+        </w:tc>
+        <w:tc>
+          <w:tcPr>
+            <w:tcW w:w="1584" w:type="dxa"/>
+            <w:tcBorders>
+              <w:top w:val="single" w:sz="2" w:space="0" w:color="E5E7EB"/>
+              <w:left w:val="single" w:sz="2" w:space="0" w:color="E5E7EB"/>
+              <w:bottom w:val="single" w:sz="2" w:space="0" w:color="E5E7EB"/>
+              <w:right w:val="single" w:sz="2" w:space="0" w:color="E5E7EB"/>
+            </w:tcBorders>
+            <w:shd w:val="clear" w:color="auto" w:fill="FFFFFF"/>
+            <w:noWrap/>
+            <w:tcMar>
+              <w:top w:w="98" w:type="dxa"/>
+              <w:left w:w="98" w:type="dxa"/>
+              <w:bottom w:w="98" w:type="dxa"/>
+              <w:right w:w="98" w:type="dxa"/>
+            </w:tcMar>
+            <w:vAlign w:val="center"/>
+            <w:hideMark/>
+          </w:tcPr>
+          <w:p>
+            <w:r>
+              <w:t>1. Printer Access</w:t>
+            </w:r>
+          </w:p>
+        </w:tc>
+        <w:tc>
+          <w:tcPr>
+            <w:tcW w:w="697" w:type="dxa"/>
+            <w:tcBorders>
+              <w:top w:val="single" w:sz="2" w:space="0" w:color="E5E7EB"/>
+              <w:left w:val="single" w:sz="2" w:space="0" w:color="E5E7EB"/>
+              <w:bottom w:val="single" w:sz="2" w:space="0" w:color="E5E7EB"/>
+              <w:right w:val="single" w:sz="2" w:space="0" w:color="E5E7EB"/>
+            </w:tcBorders>
+            <w:shd w:val="clear" w:color="auto" w:fill="FFFFFF"/>
+            <w:noWrap/>
+            <w:tcMar>
+              <w:top w:w="98" w:type="dxa"/>
+              <w:left w:w="98" w:type="dxa"/>
+              <w:bottom w:w="98" w:type="dxa"/>
+              <w:right w:w="98" w:type="dxa"/>
+            </w:tcMar>
+            <w:vAlign w:val="center"/>
+            <w:hideMark/>
+          </w:tcPr>
+          <w:p>
+            <w:r>
+              <w:rPr>
+                <w:b/>
+                <w:bCs/>
+              </w:rPr>
+              <w:t>0d 22h 4m</w:t>
+            </w:r>
+          </w:p>
+        </w:tc>
+        <w:tc>
+          <w:tcPr>
+            <w:tcW w:w="779" w:type="dxa"/>
+            <w:tcBorders>
+              <w:top w:val="single" w:sz="2" w:space="0" w:color="E5E7EB"/>
+              <w:left w:val="single" w:sz="2" w:space="0" w:color="E5E7EB"/>
+              <w:bottom w:val="single" w:sz="2" w:space="0" w:color="E5E7EB"/>
+              <w:right w:val="single" w:sz="2" w:space="0" w:color="E5E7EB"/>
+            </w:tcBorders>
+            <w:shd w:val="clear" w:color="auto" w:fill="FFFFFF"/>
+            <w:noWrap/>
+            <w:tcMar>
+              <w:top w:w="98" w:type="dxa"/>
+              <w:left w:w="98" w:type="dxa"/>
+              <w:bottom w:w="98" w:type="dxa"/>
+              <w:right w:w="98" w:type="dxa"/>
+            </w:tcMar>
+            <w:vAlign w:val="center"/>
+            <w:hideMark/>
+          </w:tcPr>
+          <w:p>
+            <w:r>
+              <w:t>Closed</w:t>
+            </w:r>
+          </w:p>
+        </w:tc>
+        <w:tc>
+          <w:tcPr>
+            <w:tcW w:w="1080" w:type="dxa"/>
+            <w:tcBorders>
+              <w:top w:val="single" w:sz="2" w:space="0" w:color="E5E7EB"/>
+              <w:left w:val="single" w:sz="2" w:space="0" w:color="E5E7EB"/>
+              <w:bottom w:val="single" w:sz="2" w:space="0" w:color="E5E7EB"/>
+              <w:right w:val="single" w:sz="2" w:space="0" w:color="E5E7EB"/>
+            </w:tcBorders>
+            <w:shd w:val="clear" w:color="auto" w:fill="FFFFFF"/>
+            <w:noWrap/>
+            <w:tcMar>
+              <w:top w:w="98" w:type="dxa"/>
+              <w:left w:w="98" w:type="dxa"/>
+              <w:bottom w:w="98" w:type="dxa"/>
+              <w:right w:w="98" w:type="dxa"/>
+            </w:tcMar>
+            <w:vAlign w:val="center"/>
+            <w:hideMark/>
+          </w:tcPr>
+          <w:p>
+            <w:r>
+              <w:t>—</w:t>
+            </w:r>
+          </w:p>
+        </w:tc>
+        <w:tc>
+          <w:tcPr>
+            <w:tcW w:w="1037" w:type="dxa"/>
+            <w:tcBorders>
+              <w:top w:val="single" w:sz="2" w:space="0" w:color="E5E7EB"/>
+              <w:left w:val="single" w:sz="2" w:space="0" w:color="E5E7EB"/>
+              <w:bottom w:val="single" w:sz="2" w:space="0" w:color="E5E7EB"/>
+              <w:right w:val="single" w:sz="2" w:space="0" w:color="E5E7EB"/>
+            </w:tcBorders>
+            <w:shd w:val="clear" w:color="auto" w:fill="FFFFFF"/>
+            <w:noWrap/>
+            <w:tcMar>
+              <w:top w:w="98" w:type="dxa"/>
+              <w:left w:w="98" w:type="dxa"/>
+              <w:bottom w:w="98" w:type="dxa"/>
+              <w:right w:w="98" w:type="dxa"/>
+            </w:tcMar>
+            <w:vAlign w:val="center"/>
+            <w:hideMark/>
+          </w:tcPr>
+          <w:p>
+            <w:r>
+              <w:t>—</w:t>
+            </w:r>
+          </w:p>
+        </w:tc>
+        <w:tc>
+          <w:tcPr>
+            <w:tcW w:w="1005" w:type="dxa"/>
+            <w:tcBorders>
+              <w:top w:val="single" w:sz="2" w:space="0" w:color="E5E7EB"/>
+              <w:left w:val="single" w:sz="2" w:space="0" w:color="E5E7EB"/>
+              <w:bottom w:val="single" w:sz="2" w:space="0" w:color="E5E7EB"/>
+              <w:right w:val="single" w:sz="2" w:space="0" w:color="E5E7EB"/>
+            </w:tcBorders>
+            <w:shd w:val="clear" w:color="auto" w:fill="FFFFFF"/>
+            <w:noWrap/>
+            <w:tcMar>
+              <w:top w:w="98" w:type="dxa"/>
+              <w:left w:w="98" w:type="dxa"/>
+              <w:bottom w:w="98" w:type="dxa"/>
+              <w:right w:w="98" w:type="dxa"/>
+            </w:tcMar>
+            <w:vAlign w:val="center"/>
+            <w:hideMark/>
+          </w:tcPr>
+          <w:p>
+            <w:r>
+              <w:t>22 Jul 26, 04:26 pm</w:t>
+            </w:r>
+          </w:p>
+        </w:tc>
+        <w:tc>
+          <w:tcPr>
+            <w:tcW w:w="758" w:type="dxa"/>
+            <w:tcBorders>
+              <w:top w:val="single" w:sz="2" w:space="0" w:color="E5E7EB"/>
+              <w:left w:val="single" w:sz="2" w:space="0" w:color="E5E7EB"/>
+              <w:bottom w:val="single" w:sz="2" w:space="0" w:color="E5E7EB"/>
+              <w:right w:val="single" w:sz="2" w:space="0" w:color="E5E7EB"/>
+            </w:tcBorders>
+            <w:shd w:val="clear" w:color="auto" w:fill="FFFFFF"/>
+            <w:noWrap/>
+            <w:tcMar>
+              <w:top w:w="98" w:type="dxa"/>
+              <w:left w:w="98" w:type="dxa"/>
+              <w:bottom w:w="98" w:type="dxa"/>
+              <w:right w:w="98" w:type="dxa"/>
+            </w:tcMar>
+            <w:vAlign w:val="center"/>
+            <w:hideMark/>
+          </w:tcPr>
+          <w:p>
+            <w:r>
+              <w:t>Ac</w:t>
+            </w:r>
+          </w:p>
+        </w:tc>
+      </w:tr>
+    </w:tbl>
+    <w:p/>
+    <w:p/>
+    <w:p/>
+    <w:p>
+      <w:r>
+        <w:drawing>
+          <wp:inline distT="0" distB="0" distL="0" distR="0" wp14:anchorId="60B02F43" wp14:editId="78FFC35F">
+            <wp:extent cx="5943600" cy="1788160"/>
+            <wp:effectExtent l="0" t="0" r="0" b="2540"/>
+            <wp:docPr id="703834099" name="Picture 1"/>
+            <wp:cNvGraphicFramePr>
+              <a:graphicFrameLocks xmlns:a="http://schemas.openxmlformats.org/drawingml/2006/main" noChangeAspect="1"/>
+            </wp:cNvGraphicFramePr>
+            <a:graphic xmlns:a="http://schemas.openxmlformats.org/drawingml/2006/main">
+              <a:graphicData uri="http://schemas.openxmlformats.org/drawingml/2006/picture">
+                <pic:pic xmlns:pic="http://schemas.openxmlformats.org/drawingml/2006/picture">
+                  <pic:nvPicPr>
+                    <pic:cNvPr id="703834099" name=""/>
+                    <pic:cNvPicPr/>
+                  </pic:nvPicPr>
+                  <pic:blipFill>
+                    <a:blip r:embed="rId11"/>
+                    <a:stretch>
+                      <a:fillRect/>
+                    </a:stretch>
+                  </pic:blipFill>
+                  <pic:spPr>
+                    <a:xfrm>
+                      <a:off x="0" y="0"/>
+                      <a:ext cx="5943600" cy="1788160"/>
+                    </a:xfrm>
+                    <a:prstGeom prst="rect">
+                      <a:avLst/>
+                    </a:prstGeom>
+                  </pic:spPr>
+                </pic:pic>
+              </a:graphicData>
+            </a:graphic>
+          </wp:inline>
+        </w:drawing>
+      </w:r>
+    </w:p>
+    <w:p/>
+    <w:p/>
+    <w:p>
+      <w:r>
+        <w:t>-------------------------------------------------------------------------------------------------------------------------------</w:t>
+      </w:r>
+    </w:p>
+    <w:p/>
+    <w:p>
+      <w:r>
+        <w:drawing>
+          <wp:inline distT="0" distB="0" distL="0" distR="0" wp14:anchorId="277493DE" wp14:editId="5CAF4509">
+            <wp:extent cx="5943600" cy="2842895"/>
+            <wp:effectExtent l="0" t="0" r="0" b="0"/>
+            <wp:docPr id="702915130" name="Picture 1"/>
+            <wp:cNvGraphicFramePr>
+              <a:graphicFrameLocks xmlns:a="http://schemas.openxmlformats.org/drawingml/2006/main" noChangeAspect="1"/>
+            </wp:cNvGraphicFramePr>
+            <a:graphic xmlns:a="http://schemas.openxmlformats.org/drawingml/2006/main">
+              <a:graphicData uri="http://schemas.openxmlformats.org/drawingml/2006/picture">
+                <pic:pic xmlns:pic="http://schemas.openxmlformats.org/drawingml/2006/picture">
+                  <pic:nvPicPr>
+                    <pic:cNvPr id="702915130" name=""/>
+                    <pic:cNvPicPr/>
+                  </pic:nvPicPr>
+                  <pic:blipFill>
+                    <a:blip r:embed="rId12"/>
+                    <a:stretch>
+                      <a:fillRect/>
+                    </a:stretch>
+                  </pic:blipFill>
+                  <pic:spPr>
+                    <a:xfrm>
+                      <a:off x="0" y="0"/>
+                      <a:ext cx="5943600" cy="2842895"/>
+                    </a:xfrm>
+                    <a:prstGeom prst="rect">
+                      <a:avLst/>
+                    </a:prstGeom>
+                  </pic:spPr>
+                </pic:pic>
+              </a:graphicData>
+            </a:graphic>
+          </wp:inline>
+        </w:drawing>
+      </w:r>
+    </w:p>
     <w:sectPr>
       <w:pgSz w:w="12240" w:h="15840"/>
       <w:pgMar w:top="1440" w:right="1440" w:bottom="1440" w:left="1440" w:header="720" w:footer="720" w:gutter="0"/>
@@ -1546,6 +2871,17 @@
       <w:shd w:val="clear" w:color="auto" w:fill="E1DFDD"/>
     </w:rPr>
   </w:style>
+  <w:style w:type="paragraph" w:styleId="NormalWeb">
+    <w:name w:val="Normal (Web)"/>
+    <w:basedOn w:val="Normal"/>
+    <w:uiPriority w:val="99"/>
+    <w:semiHidden/>
+    <w:unhideWhenUsed/>
+    <w:rsid w:val="00AF6696"/>
+    <w:rPr>
+      <w:rFonts w:ascii="Times New Roman" w:hAnsi="Times New Roman" w:cs="Times New Roman"/>
+    </w:rPr>
+  </w:style>
 </w:styles>
 </file>
 

</xml_diff>

<commit_message>
To Add Requisition Workflow(Requisition Summary,Approval Pending, Rejected)  inside Trouble Ticket Overview
</commit_message>
<xml_diff>
--- a/document/TT_Search.docx
+++ b/document/TT_Search.docx
@@ -15,8 +15,13 @@
     </w:p>
     <w:p/>
     <w:p>
-      <w:r>
-        <w:t>date : August 11, 2026</w:t>
+      <w:proofErr w:type="gramStart"/>
+      <w:r>
+        <w:t>date :</w:t>
+      </w:r>
+      <w:proofErr w:type="gramEnd"/>
+      <w:r>
+        <w:t xml:space="preserve"> August 11, 2026</w:t>
       </w:r>
     </w:p>
     <w:p/>
@@ -243,8 +248,13 @@
     </w:p>
     <w:p>
       <w:r>
-        <w:t>This is result</w:t>
-      </w:r>
+        <w:t xml:space="preserve">This </w:t>
+      </w:r>
+      <w:proofErr w:type="gramStart"/>
+      <w:r>
+        <w:t>is result</w:t>
+      </w:r>
+      <w:proofErr w:type="gramEnd"/>
     </w:p>
     <w:p>
       <w:r>
@@ -299,6 +309,7 @@
           <w:szCs w:val="32"/>
         </w:rPr>
       </w:pPr>
+      <w:proofErr w:type="gramStart"/>
       <w:r>
         <w:rPr>
           <w:b/>
@@ -306,7 +317,17 @@
           <w:sz w:val="32"/>
           <w:szCs w:val="32"/>
         </w:rPr>
-        <w:t>Today : August 12, 2026</w:t>
+        <w:t>Today :</w:t>
+      </w:r>
+      <w:proofErr w:type="gramEnd"/>
+      <w:r>
+        <w:rPr>
+          <w:b/>
+          <w:bCs/>
+          <w:sz w:val="32"/>
+          <w:szCs w:val="32"/>
+        </w:rPr>
+        <w:t xml:space="preserve"> August 12, 2026</w:t>
       </w:r>
     </w:p>
     <w:p/>
@@ -320,12 +341,33 @@
       </w:r>
       <w:proofErr w:type="spellEnd"/>
       <w:r>
-        <w:t>'] != "") {</w:t>
-      </w:r>
-    </w:p>
-    <w:p>
-      <w:r>
-        <w:t xml:space="preserve">    $statement .= " and </w:t>
+        <w:t>'</w:t>
+      </w:r>
+      <w:proofErr w:type="gramStart"/>
+      <w:r>
+        <w:t>] !</w:t>
+      </w:r>
+      <w:proofErr w:type="gramEnd"/>
+      <w:r>
+        <w:t>= "</w:t>
+      </w:r>
+      <w:proofErr w:type="gramStart"/>
+      <w:r>
+        <w:t>") {</w:t>
+      </w:r>
+      <w:proofErr w:type="gramEnd"/>
+    </w:p>
+    <w:p>
+      <w:r>
+        <w:t>    $</w:t>
+      </w:r>
+      <w:proofErr w:type="gramStart"/>
+      <w:r>
+        <w:t>statement .</w:t>
+      </w:r>
+      <w:proofErr w:type="gramEnd"/>
+      <w:r>
+        <w:t xml:space="preserve">= " and </w:t>
       </w:r>
       <w:proofErr w:type="spellStart"/>
       <w:r>
@@ -333,9 +375,14 @@
       </w:r>
       <w:proofErr w:type="spellEnd"/>
       <w:r>
-        <w:t>='$_GET[</w:t>
+        <w:t>='$_</w:t>
+      </w:r>
+      <w:proofErr w:type="gramStart"/>
+      <w:r>
+        <w:t>GET[</w:t>
       </w:r>
       <w:proofErr w:type="spellStart"/>
+      <w:proofErr w:type="gramEnd"/>
       <w:r>
         <w:t>it_personel</w:t>
       </w:r>
@@ -357,6 +404,7 @@
     </w:p>
     <w:p>
       <w:proofErr w:type="spellStart"/>
+      <w:proofErr w:type="gramStart"/>
       <w:r>
         <w:t>g.GET</w:t>
       </w:r>
@@ -364,6 +412,7 @@
       <w:r>
         <w:t>(</w:t>
       </w:r>
+      <w:proofErr w:type="gramEnd"/>
     </w:p>
     <w:p>
       <w:r>
@@ -376,10 +425,12 @@
         <w:tab/>
       </w:r>
       <w:proofErr w:type="spellStart"/>
+      <w:proofErr w:type="gramStart"/>
       <w:r>
         <w:t>h.TroubleTicketList</w:t>
       </w:r>
       <w:proofErr w:type="spellEnd"/>
+      <w:proofErr w:type="gramEnd"/>
       <w:r>
         <w:t>,</w:t>
       </w:r>
@@ -392,6 +443,7 @@
     <w:p/>
     <w:p>
       <w:proofErr w:type="spellStart"/>
+      <w:proofErr w:type="gramStart"/>
       <w:r>
         <w:t>g.GET</w:t>
       </w:r>
@@ -399,6 +451,7 @@
       <w:r>
         <w:t>(</w:t>
       </w:r>
+      <w:proofErr w:type="gramEnd"/>
     </w:p>
     <w:p>
       <w:r>
@@ -411,10 +464,12 @@
         <w:tab/>
       </w:r>
       <w:proofErr w:type="spellStart"/>
+      <w:proofErr w:type="gramStart"/>
       <w:r>
         <w:t>h.TroubleTicketITPersonnel</w:t>
       </w:r>
       <w:proofErr w:type="spellEnd"/>
+      <w:proofErr w:type="gramEnd"/>
       <w:r>
         <w:t>,</w:t>
       </w:r>
@@ -436,10 +491,12 @@
         <w:t>1. backend/internal/handler/</w:t>
       </w:r>
       <w:proofErr w:type="spellStart"/>
+      <w:proofErr w:type="gramStart"/>
       <w:r>
         <w:t>handlers.go</w:t>
       </w:r>
       <w:proofErr w:type="spellEnd"/>
+      <w:proofErr w:type="gramEnd"/>
     </w:p>
     <w:p>
       <w:r>
@@ -573,7 +630,27 @@
           <w:sz w:val="28"/>
           <w:szCs w:val="28"/>
         </w:rPr>
-        <w:t xml:space="preserve">From date and To date for search </w:t>
+        <w:t xml:space="preserve">From date and </w:t>
+      </w:r>
+      <w:proofErr w:type="gramStart"/>
+      <w:r>
+        <w:rPr>
+          <w:b/>
+          <w:bCs/>
+          <w:sz w:val="28"/>
+          <w:szCs w:val="28"/>
+        </w:rPr>
+        <w:t>To</w:t>
+      </w:r>
+      <w:proofErr w:type="gramEnd"/>
+      <w:r>
+        <w:rPr>
+          <w:b/>
+          <w:bCs/>
+          <w:sz w:val="28"/>
+          <w:szCs w:val="28"/>
+        </w:rPr>
+        <w:t xml:space="preserve"> date for search </w:t>
       </w:r>
       <w:r>
         <w:br/>
@@ -1910,6 +1987,50 @@
                     <a:xfrm>
                       <a:off x="0" y="0"/>
                       <a:ext cx="5943600" cy="2842895"/>
+                    </a:xfrm>
+                    <a:prstGeom prst="rect">
+                      <a:avLst/>
+                    </a:prstGeom>
+                  </pic:spPr>
+                </pic:pic>
+              </a:graphicData>
+            </a:graphic>
+          </wp:inline>
+        </w:drawing>
+      </w:r>
+    </w:p>
+    <w:p/>
+    <w:p/>
+    <w:p/>
+    <w:p/>
+    <w:p/>
+    <w:p>
+      <w:r>
+        <w:drawing>
+          <wp:inline distT="0" distB="0" distL="0" distR="0" wp14:anchorId="16F3C9FD" wp14:editId="7F0134AD">
+            <wp:extent cx="5943600" cy="1767205"/>
+            <wp:effectExtent l="0" t="0" r="0" b="4445"/>
+            <wp:docPr id="1141152708" name="Picture 1"/>
+            <wp:cNvGraphicFramePr>
+              <a:graphicFrameLocks xmlns:a="http://schemas.openxmlformats.org/drawingml/2006/main" noChangeAspect="1"/>
+            </wp:cNvGraphicFramePr>
+            <a:graphic xmlns:a="http://schemas.openxmlformats.org/drawingml/2006/main">
+              <a:graphicData uri="http://schemas.openxmlformats.org/drawingml/2006/picture">
+                <pic:pic xmlns:pic="http://schemas.openxmlformats.org/drawingml/2006/picture">
+                  <pic:nvPicPr>
+                    <pic:cNvPr id="1141152708" name=""/>
+                    <pic:cNvPicPr/>
+                  </pic:nvPicPr>
+                  <pic:blipFill>
+                    <a:blip r:embed="rId13"/>
+                    <a:stretch>
+                      <a:fillRect/>
+                    </a:stretch>
+                  </pic:blipFill>
+                  <pic:spPr>
+                    <a:xfrm>
+                      <a:off x="0" y="0"/>
+                      <a:ext cx="5943600" cy="1767205"/>
                     </a:xfrm>
                     <a:prstGeom prst="rect">
                       <a:avLst/>

</xml_diff>